<commit_message>
nd: petition-for-rehearing gated on latex and docx; answering-brief docx delivered, latex gated, docx reported (§ § spacing); brief-on-the-merits regenerated, still report (fb-595.54.52)
Co-Authored-By: Claude Opus 5.5 <noreply@anthropic.com>
</commit_message>
<xml_diff>
--- a/courts/eighth-circuit/north-dakota/state/supreme-court/brief-on-the-merits/usage/OUTPUT-brief-on-the-merits.docx
+++ b/courts/eighth-circuit/north-dakota/state/supreme-court/brief-on-the-merits/usage/OUTPUT-brief-on-the-merits.docx
@@ -4090,11 +4090,7 @@
         <w:t xml:space="preserve"> </w:t>
       </w:r>
       <w:r>
-        <w:t xml:space="preserve">28</w:t>
-        <w:noBreakHyphen/>
-        <w:t xml:space="preserve">32</w:t>
-        <w:noBreakHyphen/>
-        <w:t xml:space="preserve">39—just</w:t>
+        <w:t xml:space="preserve">28-⁠32-⁠39—⁠just</w:t>
       </w:r>
       <w:r>
         <w:t xml:space="preserve"> </w:t>
@@ -8610,19 +8606,7 @@
         <w:t xml:space="preserve"> </w:t>
       </w:r>
       <w:r>
-        <w:t xml:space="preserve">N.D.C.C. § 49</w:t>
-      </w:r>
-      <w:r>
-        <w:noBreakHyphen/>
-      </w:r>
-      <w:r>
-        <w:t xml:space="preserve">22</w:t>
-      </w:r>
-      <w:r>
-        <w:noBreakHyphen/>
-      </w:r>
-      <w:r>
-        <w:t xml:space="preserve">08(5) (designation</w:t>
+        <w:t xml:space="preserve">N.D.C.C. § 49-⁠22-⁠08(5) (designation</w:t>
       </w:r>
       <w:r>
         <w:t xml:space="preserve"> </w:t>
@@ -9500,25 +9484,7 @@
         <w:pStyle w:val="BodyText"/>
       </w:pPr>
       <w:r>
-        <w:t xml:space="preserve">[¶17] As detailed in the Petition to Intervene, Appellants include landowners, local governments, and ratepayers whose distinct and directly affected interests warrant intervention under N.D.A.C. § 69</w:t>
-      </w:r>
-      <w:r>
-        <w:noBreakHyphen/>
-      </w:r>
-      <w:r>
-        <w:t xml:space="preserve">02</w:t>
-      </w:r>
-      <w:r>
-        <w:noBreakHyphen/>
-      </w:r>
-      <w:r>
-        <w:t xml:space="preserve">02</w:t>
-      </w:r>
-      <w:r>
-        <w:noBreakHyphen/>
-      </w:r>
-      <w:r>
-        <w:t xml:space="preserve">05.</w:t>
+        <w:t xml:space="preserve">[¶17] As detailed in the Petition to Intervene, Appellants include landowners, local governments, and ratepayers whose distinct and directly affected interests warrant intervention under N.D.A.C. § 69-⁠02-⁠02-⁠05.</w:t>
       </w:r>
     </w:p>
     <w:p>
@@ -12797,19 +12763,7 @@
         <w:t xml:space="preserve"> </w:t>
       </w:r>
       <w:r>
-        <w:t xml:space="preserve">N.D.C.C. § 49</w:t>
-      </w:r>
-      <w:r>
-        <w:noBreakHyphen/>
-      </w:r>
-      <w:r>
-        <w:t xml:space="preserve">03</w:t>
-      </w:r>
-      <w:r>
-        <w:noBreakHyphen/>
-      </w:r>
-      <w:r>
-        <w:t xml:space="preserve">01.</w:t>
+        <w:t xml:space="preserve">N.D.C.C. § 49-⁠03-⁠01.</w:t>
       </w:r>
     </w:p>
     <w:p>
@@ -13186,7 +13140,13 @@
         <w:t xml:space="preserve"> </w:t>
       </w:r>
       <w:r>
-        <w:t xml:space="preserve">N.D.C.C. § 49</w:t>
+        <w:t xml:space="preserve">N.D.C.C. § 49-⁠22-⁠03(12)⁠(a).</w:t>
+      </w:r>
+      <w:r>
+        <w:t xml:space="preserve"> </w:t>
+      </w:r>
+      <w:r>
+        <w:t xml:space="preserve">Section 49</w:t>
       </w:r>
       <w:r>
         <w:noBreakHyphen/>
@@ -13198,24 +13158,6 @@
         <w:noBreakHyphen/>
       </w:r>
       <w:r>
-        <w:t xml:space="preserve">03(12)⁠(a).</w:t>
-      </w:r>
-      <w:r>
-        <w:t xml:space="preserve"> </w:t>
-      </w:r>
-      <w:r>
-        <w:t xml:space="preserve">Section 49</w:t>
-      </w:r>
-      <w:r>
-        <w:noBreakHyphen/>
-      </w:r>
-      <w:r>
-        <w:t xml:space="preserve">22</w:t>
-      </w:r>
-      <w:r>
-        <w:noBreakHyphen/>
-      </w:r>
-      <w:r>
         <w:t xml:space="preserve">07(1)</w:t>
       </w:r>
       <w:r>
@@ -13242,19 +13184,7 @@
         <w:noBreakHyphen/>
       </w:r>
       <w:r>
-        <w:t xml:space="preserve">22 establishes a mandatory, front-end process for high-voltage lines that exceed the statutory threshold. It requires the utility to obtain a route permit or site certificate before construction begins and prescribes a comprehensive procedure: environmental review, landowner notice, public hearings, detailed application submissions under § 49</w:t>
-      </w:r>
-      <w:r>
-        <w:noBreakHyphen/>
-      </w:r>
-      <w:r>
-        <w:t xml:space="preserve">22</w:t>
-      </w:r>
-      <w:r>
-        <w:noBreakHyphen/>
-      </w:r>
-      <w:r>
-        <w:t xml:space="preserve">08, and explicit findings of fact under § § 49</w:t>
+        <w:t xml:space="preserve">22 establishes a mandatory, front-end process for high-voltage lines that exceed the statutory threshold. It requires the utility to obtain a route permit or site certificate before construction begins and prescribes a comprehensive procedure: environmental review, landowner notice, public hearings, detailed application submissions under § 49-⁠22-⁠08, and explicit findings of fact under § § 49</w:t>
       </w:r>
       <w:r>
         <w:noBreakHyphen/>
@@ -13530,19 +13460,7 @@
         <w:noBreakHyphen/>
       </w:r>
       <w:r>
-        <w:t xml:space="preserve">03 contains no express prohibition, they may seek a CPCN for a high-voltage transmission facility under that statute. But the absence of an express bar does not equate to legislative approval. The statutory framework and policy statement in § 49</w:t>
-      </w:r>
-      <w:r>
-        <w:noBreakHyphen/>
-      </w:r>
-      <w:r>
-        <w:t xml:space="preserve">22</w:t>
-      </w:r>
-      <w:r>
-        <w:noBreakHyphen/>
-      </w:r>
-      <w:r>
-        <w:t xml:space="preserve">02</w:t>
+        <w:t xml:space="preserve">03 contains no express prohibition, they may seek a CPCN for a high-voltage transmission facility under that statute. But the absence of an express bar does not equate to legislative approval. The statutory framework and policy statement in § 49-⁠22-⁠02</w:t>
       </w:r>
       <w:r>
         <w:t xml:space="preserve"> </w:t>
@@ -14030,37 +13948,13 @@
         <w:t xml:space="preserve"> </w:t>
       </w:r>
       <w:r>
-        <w:t xml:space="preserve">N.D.C.C. § 49</w:t>
-      </w:r>
-      <w:r>
-        <w:noBreakHyphen/>
-      </w:r>
-      <w:r>
-        <w:t xml:space="preserve">22</w:t>
-      </w:r>
-      <w:r>
-        <w:noBreakHyphen/>
-      </w:r>
-      <w:r>
-        <w:t xml:space="preserve">08(1)⁠(c).</w:t>
-      </w:r>
-      <w:r>
-        <w:t xml:space="preserve"> </w:t>
-      </w:r>
-      <w:r>
-        <w:t xml:space="preserve">The Commission is then required to make findings guided by the statutory considerations, including alternatives, environmental impacts, economic impacts, existing plans, and related factors. N.D.C.C. § 49</w:t>
-      </w:r>
-      <w:r>
-        <w:noBreakHyphen/>
-      </w:r>
-      <w:r>
-        <w:t xml:space="preserve">22</w:t>
-      </w:r>
-      <w:r>
-        <w:noBreakHyphen/>
-      </w:r>
-      <w:r>
-        <w:t xml:space="preserve">09.</w:t>
+        <w:t xml:space="preserve">N.D.C.C. § 49-⁠22-⁠08(1)⁠(c).</w:t>
+      </w:r>
+      <w:r>
+        <w:t xml:space="preserve"> </w:t>
+      </w:r>
+      <w:r>
+        <w:t xml:space="preserve">The Commission is then required to make findings guided by the statutory considerations, including alternatives, environmental impacts, economic impacts, existing plans, and related factors. N.D.C.C. § 49-⁠22-⁠09.</w:t>
       </w:r>
     </w:p>
     <w:p>
@@ -14131,8 +14025,6 @@
         <w:rPr>
           <w:b/>
           <w:bCs/>
-          <w:i/>
-          <w:iCs/>
         </w:rPr>
         <w:t xml:space="preserve">Nebraska</w:t>
       </w:r>
@@ -14140,17 +14032,13 @@
         <w:rPr>
           <w:b/>
           <w:bCs/>
-          <w:i/>
-          <w:iCs/>
-        </w:rPr>
-        <w:t xml:space="preserve"> </w:t>
-      </w:r>
-      <w:r>
-        <w:rPr>
-          <w:b/>
-          <w:bCs/>
-          <w:i/>
-          <w:iCs/>
+        </w:rPr>
+        <w:t xml:space="preserve"> </w:t>
+      </w:r>
+      <w:r>
+        <w:rPr>
+          <w:b/>
+          <w:bCs/>
         </w:rPr>
         <w:t xml:space="preserve">Pub.</w:t>
       </w:r>
@@ -14158,17 +14046,13 @@
         <w:rPr>
           <w:b/>
           <w:bCs/>
-          <w:i/>
-          <w:iCs/>
-        </w:rPr>
-        <w:t xml:space="preserve"> </w:t>
-      </w:r>
-      <w:r>
-        <w:rPr>
-          <w:b/>
-          <w:bCs/>
-          <w:i/>
-          <w:iCs/>
+        </w:rPr>
+        <w:t xml:space="preserve"> </w:t>
+      </w:r>
+      <w:r>
+        <w:rPr>
+          <w:b/>
+          <w:bCs/>
         </w:rPr>
         <w:t xml:space="preserve">Power</w:t>
       </w:r>
@@ -14176,17 +14060,13 @@
         <w:rPr>
           <w:b/>
           <w:bCs/>
-          <w:i/>
-          <w:iCs/>
-        </w:rPr>
-        <w:t xml:space="preserve"> </w:t>
-      </w:r>
-      <w:r>
-        <w:rPr>
-          <w:b/>
-          <w:bCs/>
-          <w:i/>
-          <w:iCs/>
+        </w:rPr>
+        <w:t xml:space="preserve"> </w:t>
+      </w:r>
+      <w:r>
+        <w:rPr>
+          <w:b/>
+          <w:bCs/>
         </w:rPr>
         <w:t xml:space="preserve">Dist.</w:t>
       </w:r>
@@ -14649,19 +14529,7 @@
         <w:t xml:space="preserve"> </w:t>
       </w:r>
       <w:r>
-        <w:t xml:space="preserve">N.D.C.C. § 49</w:t>
-      </w:r>
-      <w:r>
-        <w:noBreakHyphen/>
-      </w:r>
-      <w:r>
-        <w:t xml:space="preserve">22</w:t>
-      </w:r>
-      <w:r>
-        <w:noBreakHyphen/>
-      </w:r>
-      <w:r>
-        <w:t xml:space="preserve">08(1)⁠(c),</w:t>
+        <w:t xml:space="preserve">N.D.C.C. § 49-⁠22-⁠08(1)⁠(c),</w:t>
       </w:r>
       <w:r>
         <w:t xml:space="preserve"> </w:t>
@@ -14967,7 +14835,33 @@
         <w:t xml:space="preserve"> </w:t>
       </w:r>
       <w:r>
-        <w:t xml:space="preserve">N.D.C.C. § 49</w:t>
+        <w:t xml:space="preserve">N.D.C.C. § 49-⁠22-⁠02</w:t>
+      </w:r>
+      <w:r>
+        <w:t xml:space="preserve"> </w:t>
+      </w:r>
+      <w:r>
+        <w:t xml:space="preserve">(emphasis added).</w:t>
+      </w:r>
+    </w:p>
+    <w:p>
+      <w:pPr>
+        <w:pStyle w:val="BodyText"/>
+      </w:pPr>
+      <w:r>
+        <w:t xml:space="preserve">[¶50] The</w:t>
+      </w:r>
+      <w:r>
+        <w:t xml:space="preserve"> </w:t>
+      </w:r>
+      <w:r>
+        <w:t xml:space="preserve">“efficient use of resources”</w:t>
+      </w:r>
+      <w:r>
+        <w:t xml:space="preserve"> </w:t>
+      </w:r>
+      <w:r>
+        <w:t xml:space="preserve">necessarily reflects a need inquiry, balancing demand against environmental and economic impacts. The statute reinforces this requirement in multiple provisions. Section 49</w:t>
       </w:r>
       <w:r>
         <w:noBreakHyphen/>
@@ -14979,33 +14873,25 @@
         <w:noBreakHyphen/>
       </w:r>
       <w:r>
-        <w:t xml:space="preserve">02</w:t>
-      </w:r>
-      <w:r>
-        <w:t xml:space="preserve"> </w:t>
-      </w:r>
-      <w:r>
-        <w:t xml:space="preserve">(emphasis added).</w:t>
-      </w:r>
-    </w:p>
-    <w:p>
-      <w:pPr>
-        <w:pStyle w:val="BodyText"/>
-      </w:pPr>
-      <w:r>
-        <w:t xml:space="preserve">[¶50] The</w:t>
-      </w:r>
-      <w:r>
-        <w:t xml:space="preserve"> </w:t>
-      </w:r>
-      <w:r>
-        <w:t xml:space="preserve">“efficient use of resources”</w:t>
-      </w:r>
-      <w:r>
-        <w:t xml:space="preserve"> </w:t>
-      </w:r>
-      <w:r>
-        <w:t xml:space="preserve">necessarily reflects a need inquiry, balancing demand against environmental and economic impacts. The statute reinforces this requirement in multiple provisions. Section 49</w:t>
+        <w:t xml:space="preserve">08(1)⁠(c)</w:t>
+      </w:r>
+      <w:r>
+        <w:t xml:space="preserve"> </w:t>
+      </w:r>
+      <w:r>
+        <w:t xml:space="preserve">requires an applicant to submit</w:t>
+      </w:r>
+      <w:r>
+        <w:t xml:space="preserve"> </w:t>
+      </w:r>
+      <w:r>
+        <w:t xml:space="preserve">“[a] statement explaining the need for the facility.”</w:t>
+      </w:r>
+      <w:r>
+        <w:t xml:space="preserve"> </w:t>
+      </w:r>
+      <w:r>
+        <w:t xml:space="preserve">Section 49</w:t>
       </w:r>
       <w:r>
         <w:noBreakHyphen/>
@@ -15017,73 +14903,19 @@
         <w:noBreakHyphen/>
       </w:r>
       <w:r>
-        <w:t xml:space="preserve">08(1)⁠(c)</w:t>
-      </w:r>
-      <w:r>
-        <w:t xml:space="preserve"> </w:t>
-      </w:r>
-      <w:r>
-        <w:t xml:space="preserve">requires an applicant to submit</w:t>
-      </w:r>
-      <w:r>
-        <w:t xml:space="preserve"> </w:t>
-      </w:r>
-      <w:r>
-        <w:t xml:space="preserve">“[a] statement explaining the need for the facility.”</w:t>
-      </w:r>
-      <w:r>
-        <w:t xml:space="preserve"> </w:t>
-      </w:r>
-      <w:r>
-        <w:t xml:space="preserve">Section 49</w:t>
-      </w:r>
-      <w:r>
-        <w:noBreakHyphen/>
-      </w:r>
-      <w:r>
-        <w:t xml:space="preserve">22</w:t>
-      </w:r>
-      <w:r>
-        <w:noBreakHyphen/>
-      </w:r>
-      <w:r>
         <w:t xml:space="preserve">09</w:t>
       </w:r>
       <w:r>
         <w:t xml:space="preserve"> </w:t>
       </w:r>
       <w:r>
-        <w:t xml:space="preserve">directs the Commission to be guided by specific considerations in reaching its decision, including adverse environmental effects, alternatives that minimize those effects, and the direct and indirect economic impacts of the facility. N.D.C.C. § 49</w:t>
-      </w:r>
-      <w:r>
-        <w:noBreakHyphen/>
-      </w:r>
-      <w:r>
-        <w:t xml:space="preserve">22</w:t>
-      </w:r>
-      <w:r>
-        <w:noBreakHyphen/>
-      </w:r>
-      <w:r>
-        <w:t xml:space="preserve">09(1),</w:t>
-      </w:r>
-      <w:r>
-        <w:t xml:space="preserve"> </w:t>
-      </w:r>
-      <w:r>
-        <w:t xml:space="preserve">(4), (5), (7). And § 49</w:t>
-      </w:r>
-      <w:r>
-        <w:noBreakHyphen/>
-      </w:r>
-      <w:r>
-        <w:t xml:space="preserve">22</w:t>
-      </w:r>
-      <w:r>
-        <w:noBreakHyphen/>
-      </w:r>
-      <w:r>
-        <w:t xml:space="preserve">16(2) requires the Commission, in deciding whether to preempt local land-use and zoning rules, to consider</w:t>
+        <w:t xml:space="preserve">directs the Commission to be guided by specific considerations in reaching its decision, including adverse environmental effects, alternatives that minimize those effects, and the direct and indirect economic impacts of the facility. N.D.C.C. § 49-⁠22-⁠09(1),</w:t>
+      </w:r>
+      <w:r>
+        <w:t xml:space="preserve"> </w:t>
+      </w:r>
+      <w:r>
+        <w:t xml:space="preserve">(4), (5), (7). And § 49-⁠22-⁠16(2) requires the Commission, in deciding whether to preempt local land-use and zoning rules, to consider</w:t>
       </w:r>
       <w:r>
         <w:t xml:space="preserve"> </w:t>
@@ -16249,67 +16081,19 @@
         <w:noBreakHyphen/>
       </w:r>
       <w:r>
-        <w:t xml:space="preserve">02; N.D.C.C. § 28</w:t>
-      </w:r>
-      <w:r>
-        <w:noBreakHyphen/>
-      </w:r>
-      <w:r>
-        <w:t xml:space="preserve">32</w:t>
-      </w:r>
-      <w:r>
-        <w:noBreakHyphen/>
-      </w:r>
-      <w:r>
-        <w:t xml:space="preserve">42.</w:t>
-      </w:r>
-      <w:r>
-        <w:t xml:space="preserve"> </w:t>
-      </w:r>
-      <w:r>
-        <w:t xml:space="preserve">Although the Public Service Commission is generally exempt from portions of the Administrative Agencies Practice Act, N.D.C.C. § 54</w:t>
-      </w:r>
-      <w:r>
-        <w:noBreakHyphen/>
-      </w:r>
-      <w:r>
-        <w:t xml:space="preserve">57</w:t>
-      </w:r>
-      <w:r>
-        <w:noBreakHyphen/>
-      </w:r>
-      <w:r>
-        <w:t xml:space="preserve">03(1), the finality principles codified in N.D.C.C. § 28</w:t>
-      </w:r>
-      <w:r>
-        <w:noBreakHyphen/>
-      </w:r>
-      <w:r>
-        <w:t xml:space="preserve">32</w:t>
-      </w:r>
-      <w:r>
-        <w:noBreakHyphen/>
-      </w:r>
-      <w:r>
-        <w:t xml:space="preserve">39</w:t>
-      </w:r>
-      <w:r>
-        <w:t xml:space="preserve"> </w:t>
-      </w:r>
-      <w:r>
-        <w:t xml:space="preserve">remain the touchstone for what makes an order judicially reviewable: (1) explicit findings of fact and separate conclusions of law and (2) service of those findings, conclusions, and the order on all parties. N.D.C.C. § 28</w:t>
-      </w:r>
-      <w:r>
-        <w:noBreakHyphen/>
-      </w:r>
-      <w:r>
-        <w:t xml:space="preserve">32</w:t>
-      </w:r>
-      <w:r>
-        <w:noBreakHyphen/>
-      </w:r>
-      <w:r>
-        <w:t xml:space="preserve">39(1)-(2).</w:t>
+        <w:t xml:space="preserve">02; N.D.C.C. § 28-⁠32-⁠42.</w:t>
+      </w:r>
+      <w:r>
+        <w:t xml:space="preserve"> </w:t>
+      </w:r>
+      <w:r>
+        <w:t xml:space="preserve">Although the Public Service Commission is generally exempt from portions of the Administrative Agencies Practice Act, N.D.C.C. § 54-⁠57-⁠03(1), the finality principles codified in N.D.C.C. § 28-⁠32-⁠39</w:t>
+      </w:r>
+      <w:r>
+        <w:t xml:space="preserve"> </w:t>
+      </w:r>
+      <w:r>
+        <w:t xml:space="preserve">remain the touchstone for what makes an order judicially reviewable: (1) explicit findings of fact and separate conclusions of law and (2) service of those findings, conclusions, and the order on all parties. N.D.C.C. § 28-⁠32-⁠39(1)-⁠(2).</w:t>
       </w:r>
     </w:p>
     <w:p>
@@ -16554,37 +16338,13 @@
         <w:t xml:space="preserve"> </w:t>
       </w:r>
       <w:r>
-        <w:t xml:space="preserve">under N.D.C.C. § 28</w:t>
-      </w:r>
-      <w:r>
-        <w:noBreakHyphen/>
-      </w:r>
-      <w:r>
-        <w:t xml:space="preserve">32</w:t>
-      </w:r>
-      <w:r>
-        <w:noBreakHyphen/>
-      </w:r>
-      <w:r>
-        <w:t xml:space="preserve">22.</w:t>
-      </w:r>
-      <w:r>
-        <w:t xml:space="preserve"> </w:t>
-      </w:r>
-      <w:r>
-        <w:t xml:space="preserve">But § 28</w:t>
-      </w:r>
-      <w:r>
-        <w:noBreakHyphen/>
-      </w:r>
-      <w:r>
-        <w:t xml:space="preserve">32</w:t>
-      </w:r>
-      <w:r>
-        <w:noBreakHyphen/>
-      </w:r>
-      <w:r>
-        <w:t xml:space="preserve">39(1)</w:t>
+        <w:t xml:space="preserve">under N.D.C.C. § 28-⁠32-⁠22.</w:t>
+      </w:r>
+      <w:r>
+        <w:t xml:space="preserve"> </w:t>
+      </w:r>
+      <w:r>
+        <w:t xml:space="preserve">But § 28-⁠32-⁠39(1)</w:t>
       </w:r>
       <w:r>
         <w:t xml:space="preserve"> </w:t>
@@ -16630,19 +16390,7 @@
         <w:t xml:space="preserve">Corp.</w:t>
       </w:r>
       <w:r>
-        <w:t xml:space="preserve">, 318 U.S. 80, 94 (1943). And § 28</w:t>
-      </w:r>
-      <w:r>
-        <w:noBreakHyphen/>
-      </w:r>
-      <w:r>
-        <w:t xml:space="preserve">32</w:t>
-      </w:r>
-      <w:r>
-        <w:noBreakHyphen/>
-      </w:r>
-      <w:r>
-        <w:t xml:space="preserve">22</w:t>
+        <w:t xml:space="preserve">, 318 U.S. 80, 94 (1943). And § 28-⁠32-⁠22</w:t>
       </w:r>
       <w:r>
         <w:t xml:space="preserve"> </w:t>
@@ -16875,55 +16623,19 @@
         <w:t xml:space="preserve"> </w:t>
       </w:r>
       <w:r>
-        <w:t xml:space="preserve">(requiring decisions grounded in the evidence, the application, § 49</w:t>
-      </w:r>
-      <w:r>
-        <w:noBreakHyphen/>
-      </w:r>
-      <w:r>
-        <w:t xml:space="preserve">22</w:t>
-      </w:r>
-      <w:r>
-        <w:noBreakHyphen/>
-      </w:r>
-      <w:r>
-        <w:t xml:space="preserve">05.1</w:t>
-      </w:r>
-      <w:r>
-        <w:t xml:space="preserve"> </w:t>
-      </w:r>
-      <w:r>
-        <w:t xml:space="preserve">criteria, and § 49</w:t>
-      </w:r>
-      <w:r>
-        <w:noBreakHyphen/>
-      </w:r>
-      <w:r>
-        <w:t xml:space="preserve">22</w:t>
-      </w:r>
-      <w:r>
-        <w:noBreakHyphen/>
-      </w:r>
-      <w:r>
-        <w:t xml:space="preserve">09</w:t>
-      </w:r>
-      <w:r>
-        <w:t xml:space="preserve"> </w:t>
-      </w:r>
-      <w:r>
-        <w:t xml:space="preserve">considerations). Judicial review under § 49</w:t>
-      </w:r>
-      <w:r>
-        <w:noBreakHyphen/>
-      </w:r>
-      <w:r>
-        <w:t xml:space="preserve">22</w:t>
-      </w:r>
-      <w:r>
-        <w:noBreakHyphen/>
-      </w:r>
-      <w:r>
-        <w:t xml:space="preserve">19</w:t>
+        <w:t xml:space="preserve">(requiring decisions grounded in the evidence, the application, § 49-⁠22-⁠05.1</w:t>
+      </w:r>
+      <w:r>
+        <w:t xml:space="preserve"> </w:t>
+      </w:r>
+      <w:r>
+        <w:t xml:space="preserve">criteria, and § 49-⁠22-⁠09</w:t>
+      </w:r>
+      <w:r>
+        <w:t xml:space="preserve"> </w:t>
+      </w:r>
+      <w:r>
+        <w:t xml:space="preserve">considerations). Judicial review under § 49-⁠22-⁠19</w:t>
       </w:r>
       <w:r>
         <w:t xml:space="preserve"> </w:t>
@@ -17079,11 +16791,7 @@
           <w:i/>
           <w:iCs/>
         </w:rPr>
-        <w:t xml:space="preserve">28</w:t>
-        <w:noBreakHyphen/>
-        <w:t xml:space="preserve">32</w:t>
-        <w:noBreakHyphen/>
-        <w:t xml:space="preserve">39—just</w:t>
+        <w:t xml:space="preserve">28-⁠32-⁠39—⁠just</w:t>
       </w:r>
       <w:r>
         <w:rPr>
@@ -17181,25 +16889,7 @@
         <w:pStyle w:val="BodyText"/>
       </w:pPr>
       <w:r>
-        <w:t xml:space="preserve">[¶59] The June 18 order acknowledges that the outdated reference in N.D.A.C. § 69</w:t>
-      </w:r>
-      <w:r>
-        <w:noBreakHyphen/>
-      </w:r>
-      <w:r>
-        <w:t xml:space="preserve">02</w:t>
-      </w:r>
-      <w:r>
-        <w:noBreakHyphen/>
-      </w:r>
-      <w:r>
-        <w:t xml:space="preserve">06</w:t>
-      </w:r>
-      <w:r>
-        <w:noBreakHyphen/>
-      </w:r>
-      <w:r>
-        <w:t xml:space="preserve">02</w:t>
+        <w:t xml:space="preserve">[¶59] The June 18 order acknowledges that the outdated reference in N.D.A.C. § 69-⁠02-⁠06-⁠02</w:t>
       </w:r>
       <w:r>
         <w:t xml:space="preserve"> </w:t>
@@ -17217,37 +16907,13 @@
         <w:t xml:space="preserve"> </w:t>
       </w:r>
       <w:r>
-        <w:t xml:space="preserve">to § 28</w:t>
-      </w:r>
-      <w:r>
-        <w:noBreakHyphen/>
-      </w:r>
-      <w:r>
-        <w:t xml:space="preserve">32</w:t>
-      </w:r>
-      <w:r>
-        <w:noBreakHyphen/>
-      </w:r>
-      <w:r>
-        <w:t xml:space="preserve">39.</w:t>
-      </w:r>
-      <w:r>
-        <w:t xml:space="preserve"> </w:t>
-      </w:r>
-      <w:r>
-        <w:t xml:space="preserve">That concession underscores Appellants’ point: § 28</w:t>
-      </w:r>
-      <w:r>
-        <w:noBreakHyphen/>
-      </w:r>
-      <w:r>
-        <w:t xml:space="preserve">32</w:t>
-      </w:r>
-      <w:r>
-        <w:noBreakHyphen/>
-      </w:r>
-      <w:r>
-        <w:t xml:space="preserve">39(1)-(2)</w:t>
+        <w:t xml:space="preserve">to § 28-⁠32-⁠39.</w:t>
+      </w:r>
+      <w:r>
+        <w:t xml:space="preserve"> </w:t>
+      </w:r>
+      <w:r>
+        <w:t xml:space="preserve">That concession underscores Appellants’ point: § 28-⁠32-⁠39(1)-⁠(2)</w:t>
       </w:r>
       <w:r>
         <w:t xml:space="preserve"> </w:t>
@@ -17294,19 +16960,7 @@
         <w:noBreakHyphen/>
       </w:r>
       <w:r>
-        <w:t xml:space="preserve">32 expressly authorizes courts to set aside decisions that are unlawful, unsupported by evidence, or issued without fair procedure. N.D.C.C. § 28</w:t>
-      </w:r>
-      <w:r>
-        <w:noBreakHyphen/>
-      </w:r>
-      <w:r>
-        <w:t xml:space="preserve">32</w:t>
-      </w:r>
-      <w:r>
-        <w:noBreakHyphen/>
-      </w:r>
-      <w:r>
-        <w:t xml:space="preserve">46.</w:t>
+        <w:t xml:space="preserve">32 expressly authorizes courts to set aside decisions that are unlawful, unsupported by evidence, or issued without fair procedure. N.D.C.C. § 28-⁠32-⁠46.</w:t>
       </w:r>
       <w:r>
         <w:t xml:space="preserve"> </w:t>
@@ -17320,37 +16974,13 @@
         <w:pStyle w:val="BodyText"/>
       </w:pPr>
       <w:r>
-        <w:t xml:space="preserve">[¶61] The Commission’s continuing jurisdiction underscores that this defect is not merely technical. Agencies retain authority to reopen where statutes provide. N.D.C.C. § 28</w:t>
-      </w:r>
-      <w:r>
-        <w:noBreakHyphen/>
-      </w:r>
-      <w:r>
-        <w:t xml:space="preserve">32</w:t>
-      </w:r>
-      <w:r>
-        <w:noBreakHyphen/>
-      </w:r>
-      <w:r>
-        <w:t xml:space="preserve">40(5).</w:t>
-      </w:r>
-      <w:r>
-        <w:t xml:space="preserve"> </w:t>
-      </w:r>
-      <w:r>
-        <w:t xml:space="preserve">The Siting Act preserves ongoing oversight, including revocation or suspension for false statements, noncompliance, or unfair land-acquisition tactics. N.D.C.C. § 49</w:t>
-      </w:r>
-      <w:r>
-        <w:noBreakHyphen/>
-      </w:r>
-      <w:r>
-        <w:t xml:space="preserve">22</w:t>
-      </w:r>
-      <w:r>
-        <w:noBreakHyphen/>
-      </w:r>
-      <w:r>
-        <w:t xml:space="preserve">20.</w:t>
+        <w:t xml:space="preserve">[¶61] The Commission’s continuing jurisdiction underscores that this defect is not merely technical. Agencies retain authority to reopen where statutes provide. N.D.C.C. § 28-⁠32-⁠40(5).</w:t>
+      </w:r>
+      <w:r>
+        <w:t xml:space="preserve"> </w:t>
+      </w:r>
+      <w:r>
+        <w:t xml:space="preserve">The Siting Act preserves ongoing oversight, including revocation or suspension for false statements, noncompliance, or unfair land-acquisition tactics. N.D.C.C. § 49-⁠22-⁠20.</w:t>
       </w:r>
       <w:r>
         <w:t xml:space="preserve"> </w:t>
@@ -17775,19 +17405,7 @@
         <w:t xml:space="preserve"> </w:t>
       </w:r>
       <w:r>
-        <w:t xml:space="preserve">and is arbitrary under § 28</w:t>
-      </w:r>
-      <w:r>
-        <w:noBreakHyphen/>
-      </w:r>
-      <w:r>
-        <w:t xml:space="preserve">32</w:t>
-      </w:r>
-      <w:r>
-        <w:noBreakHyphen/>
-      </w:r>
-      <w:r>
-        <w:t xml:space="preserve">46.</w:t>
+        <w:t xml:space="preserve">and is arbitrary under § 28-⁠32-⁠46.</w:t>
       </w:r>
       <w:r>
         <w:t xml:space="preserve"> </w:t>
@@ -18137,25 +17755,7 @@
         <w:pStyle w:val="BodyText"/>
       </w:pPr>
       <w:r>
-        <w:t xml:space="preserve">[¶64] Intervention should be liberally allowed where substantial rights may be affected and existing parties do not adequately represent those interests. N.D.A.C. § 69</w:t>
-      </w:r>
-      <w:r>
-        <w:noBreakHyphen/>
-      </w:r>
-      <w:r>
-        <w:t xml:space="preserve">02</w:t>
-      </w:r>
-      <w:r>
-        <w:noBreakHyphen/>
-      </w:r>
-      <w:r>
-        <w:t xml:space="preserve">02</w:t>
-      </w:r>
-      <w:r>
-        <w:noBreakHyphen/>
-      </w:r>
-      <w:r>
-        <w:t xml:space="preserve">05;</w:t>
+        <w:t xml:space="preserve">[¶64] Intervention should be liberally allowed where substantial rights may be affected and existing parties do not adequately represent those interests. N.D.A.C. § 69-⁠02-⁠02-⁠05;</w:t>
       </w:r>
       <w:r>
         <w:t xml:space="preserve"> </w:t>
@@ -18180,19 +17780,7 @@
         <w:noBreakHyphen/>
       </w:r>
       <w:r>
-        <w:t xml:space="preserve">31 (N.D. 2020). Informal disposition is permissible only if it does not substantially prejudice party rights. N.D.C.C. § 28</w:t>
-      </w:r>
-      <w:r>
-        <w:noBreakHyphen/>
-      </w:r>
-      <w:r>
-        <w:t xml:space="preserve">32</w:t>
-      </w:r>
-      <w:r>
-        <w:noBreakHyphen/>
-      </w:r>
-      <w:r>
-        <w:t xml:space="preserve">22.</w:t>
+        <w:t xml:space="preserve">31 (N.D. 2020). Informal disposition is permissible only if it does not substantially prejudice party rights. N.D.C.C. § 28-⁠32-⁠22.</w:t>
       </w:r>
     </w:p>
     <w:p>
@@ -18548,25 +18136,7 @@
         <w:t xml:space="preserve"> </w:t>
       </w:r>
       <w:r>
-        <w:t xml:space="preserve">and because N.D.A.C. § 69</w:t>
-      </w:r>
-      <w:r>
-        <w:noBreakHyphen/>
-      </w:r>
-      <w:r>
-        <w:t xml:space="preserve">02</w:t>
-      </w:r>
-      <w:r>
-        <w:noBreakHyphen/>
-      </w:r>
-      <w:r>
-        <w:t xml:space="preserve">02</w:t>
-      </w:r>
-      <w:r>
-        <w:noBreakHyphen/>
-      </w:r>
-      <w:r>
-        <w:t xml:space="preserve">05(2)</w:t>
+        <w:t xml:space="preserve">and because N.D.A.C. § 69-⁠02-⁠02-⁠05(2)</w:t>
       </w:r>
       <w:r>
         <w:t xml:space="preserve"> </w:t>
@@ -18608,19 +18178,7 @@
         <w:t xml:space="preserve"> </w:t>
       </w:r>
       <w:r>
-        <w:t xml:space="preserve">does not bar intervention; the agency must instead ensure that the informal path does not extinguish participation by those whose property and governance rights are at stake. N.D.C.C. § 28</w:t>
-      </w:r>
-      <w:r>
-        <w:noBreakHyphen/>
-      </w:r>
-      <w:r>
-        <w:t xml:space="preserve">32</w:t>
-      </w:r>
-      <w:r>
-        <w:noBreakHyphen/>
-      </w:r>
-      <w:r>
-        <w:t xml:space="preserve">22.</w:t>
+        <w:t xml:space="preserve">does not bar intervention; the agency must instead ensure that the informal path does not extinguish participation by those whose property and governance rights are at stake. N.D.C.C. § 28-⁠32-⁠22.</w:t>
       </w:r>
     </w:p>
     <w:p>
@@ -18742,19 +18300,7 @@
         <w:t xml:space="preserve"> </w:t>
       </w:r>
       <w:r>
-        <w:t xml:space="preserve">N.D.C.C. § 28</w:t>
-      </w:r>
-      <w:r>
-        <w:noBreakHyphen/>
-      </w:r>
-      <w:r>
-        <w:t xml:space="preserve">32</w:t>
-      </w:r>
-      <w:r>
-        <w:noBreakHyphen/>
-      </w:r>
-      <w:r>
-        <w:t xml:space="preserve">39(1)-(2);</w:t>
+        <w:t xml:space="preserve">N.D.C.C. § 28-⁠32-⁠39(1)-⁠(2);</w:t>
       </w:r>
       <w:r>
         <w:t xml:space="preserve"> </w:t>
@@ -18895,19 +18441,7 @@
         <w:pStyle w:val="BodyText"/>
       </w:pPr>
       <w:r>
-        <w:t xml:space="preserve">[¶67] The Commission retains continuing authority to revisit its orders where provided by statute. N.D.C.C. § 28</w:t>
-      </w:r>
-      <w:r>
-        <w:noBreakHyphen/>
-      </w:r>
-      <w:r>
-        <w:t xml:space="preserve">32</w:t>
-      </w:r>
-      <w:r>
-        <w:noBreakHyphen/>
-      </w:r>
-      <w:r>
-        <w:t xml:space="preserve">40(5);</w:t>
+        <w:t xml:space="preserve">[¶67] The Commission retains continuing authority to revisit its orders where provided by statute. N.D.C.C. § 28-⁠32-⁠40(5);</w:t>
       </w:r>
       <w:r>
         <w:t xml:space="preserve"> </w:t>
@@ -18941,19 +18475,7 @@
         <w:t xml:space="preserve"> </w:t>
       </w:r>
       <w:r>
-        <w:t xml:space="preserve">Appellants’ rights and contravened § 28</w:t>
-      </w:r>
-      <w:r>
-        <w:noBreakHyphen/>
-      </w:r>
-      <w:r>
-        <w:t xml:space="preserve">32</w:t>
-      </w:r>
-      <w:r>
-        <w:noBreakHyphen/>
-      </w:r>
-      <w:r>
-        <w:t xml:space="preserve">22.</w:t>
+        <w:t xml:space="preserve">Appellants’ rights and contravened § 28-⁠32-⁠22.</w:t>
       </w:r>
     </w:p>
     <w:p>
@@ -19876,37 +19398,13 @@
         <w:pStyle w:val="BodyText"/>
       </w:pPr>
       <w:r>
-        <w:t xml:space="preserve">[¶71] The June 18 order invokes N.D.C.C. § 28</w:t>
-      </w:r>
-      <w:r>
-        <w:noBreakHyphen/>
-      </w:r>
-      <w:r>
-        <w:t xml:space="preserve">32</w:t>
-      </w:r>
-      <w:r>
-        <w:noBreakHyphen/>
-      </w:r>
-      <w:r>
-        <w:t xml:space="preserve">22</w:t>
-      </w:r>
-      <w:r>
-        <w:t xml:space="preserve"> </w:t>
-      </w:r>
-      <w:r>
-        <w:t xml:space="preserve">to justify an informal path, citing notice by publication and an opportunity to submit comments/​requests for hearing in spring 2024. But § 28</w:t>
-      </w:r>
-      <w:r>
-        <w:noBreakHyphen/>
-      </w:r>
-      <w:r>
-        <w:t xml:space="preserve">32</w:t>
-      </w:r>
-      <w:r>
-        <w:noBreakHyphen/>
-      </w:r>
-      <w:r>
-        <w:t xml:space="preserve">22</w:t>
+        <w:t xml:space="preserve">[¶71] The June 18 order invokes N.D.C.C. § 28-⁠32-⁠22</w:t>
+      </w:r>
+      <w:r>
+        <w:t xml:space="preserve"> </w:t>
+      </w:r>
+      <w:r>
+        <w:t xml:space="preserve">to justify an informal path, citing notice by publication and an opportunity to submit comments/​requests for hearing in spring 2024. But § 28-⁠32-⁠22</w:t>
       </w:r>
       <w:r>
         <w:t xml:space="preserve"> </w:t>
@@ -19924,19 +19422,7 @@
         <w:t xml:space="preserve"> </w:t>
       </w:r>
       <w:r>
-        <w:t xml:space="preserve">rights. Here, informal disposition became a shield against participation: there was no hearing; there were no findings and conclusions to make the decision reviewable; and those with the most at stake were denied entry when they sought to intervene after new developments. That is the definition of substantial prejudice. And because the November 20 order is not final under § 28</w:t>
-      </w:r>
-      <w:r>
-        <w:noBreakHyphen/>
-      </w:r>
-      <w:r>
-        <w:t xml:space="preserve">32</w:t>
-      </w:r>
-      <w:r>
-        <w:noBreakHyphen/>
-      </w:r>
-      <w:r>
-        <w:t xml:space="preserve">39,</w:t>
+        <w:t xml:space="preserve">rights. Here, informal disposition became a shield against participation: there was no hearing; there were no findings and conclusions to make the decision reviewable; and those with the most at stake were denied entry when they sought to intervene after new developments. That is the definition of substantial prejudice. And because the November 20 order is not final under § 28-⁠32-⁠39,</w:t>
       </w:r>
       <w:r>
         <w:t xml:space="preserve"> </w:t>
@@ -19970,19 +19456,7 @@
         <w:t xml:space="preserve"> </w:t>
       </w:r>
       <w:r>
-        <w:t xml:space="preserve">N.D.C.C. § 28</w:t>
-      </w:r>
-      <w:r>
-        <w:noBreakHyphen/>
-      </w:r>
-      <w:r>
-        <w:t xml:space="preserve">32</w:t>
-      </w:r>
-      <w:r>
-        <w:noBreakHyphen/>
-      </w:r>
-      <w:r>
-        <w:t xml:space="preserve">46</w:t>
+        <w:t xml:space="preserve">N.D.C.C. § 28-⁠32-⁠46</w:t>
       </w:r>
       <w:r>
         <w:t xml:space="preserve"> </w:t>
@@ -22124,6 +21598,7 @@
     <w:unhideWhenUsed/>
     <w:qFormat/>
     <w:pPr>
+      <w:keepLines/>
       <w:spacing w:before="0" w:after="140" w:line="552" w:lineRule="exact"/>
     </w:pPr>
     <w:rPr>
@@ -22374,6 +21849,33 @@
     <w:pPr>
       <w:spacing w:before="0" w:after="0" w:line="552" w:lineRule="exact"/>
       <w:ind w:left="2160" w:hanging="720"/>
+    </w:pPr>
+  </w:style>
+  <w:style w:type="paragraph" w:customStyle="1" w:styleId="XdQuoteList1">
+    <w:name w:val="Xd Quote List 1"/>
+    <w:basedOn w:val="Normal"/>
+    <w:qFormat/>
+    <w:pPr>
+      <w:spacing w:before="0" w:after="0" w:line="276" w:lineRule="exact"/>
+      <w:ind w:left="1440" w:right="720" w:hanging="720"/>
+    </w:pPr>
+  </w:style>
+  <w:style w:type="paragraph" w:customStyle="1" w:styleId="XdQuoteList2">
+    <w:name w:val="Xd Quote List 2"/>
+    <w:basedOn w:val="Normal"/>
+    <w:qFormat/>
+    <w:pPr>
+      <w:spacing w:before="0" w:after="0" w:line="276" w:lineRule="exact"/>
+      <w:ind w:left="2160" w:right="720" w:hanging="720"/>
+    </w:pPr>
+  </w:style>
+  <w:style w:type="paragraph" w:customStyle="1" w:styleId="XdQuoteList3">
+    <w:name w:val="Xd Quote List 3"/>
+    <w:basedOn w:val="Normal"/>
+    <w:qFormat/>
+    <w:pPr>
+      <w:spacing w:before="0" w:after="0" w:line="276" w:lineRule="exact"/>
+      <w:ind w:left="2880" w:right="720" w:hanging="720"/>
     </w:pPr>
   </w:style>
   <w:style w:type="paragraph" w:customStyle="1" w:styleId="XdList1">

</xml_diff>